<commit_message>
feat(md2docx): add metadata pages and document control
</commit_message>
<xml_diff>
--- a/03_Personal/Consolidacion_Markdown_DOCX/assets/templates/plantilla_pulse.docx
+++ b/03_Personal/Consolidacion_Markdown_DOCX/assets/templates/plantilla_pulse.docx
@@ -14,14 +14,18 @@
         <w:p/>
         <w:p>
           <w:pPr>
-            <w:rPr>
-              <w:rFonts w:asciiTheme="majorHAnsi" w:eastAsiaTheme="majorEastAsia" w:hAnsiTheme="majorHAnsi" w:cstheme="majorBidi"/>
-              <w:color w:val="17365D" w:themeColor="text2" w:themeShade="BF"/>
-              <w:spacing w:val="5"/>
-              <w:kern w:val="28"/>
-              <w:sz w:val="52"/>
-              <w:szCs w:val="52"/>
-            </w:rPr>
+            <w:sectPr>
+              <w:headerReference w:type="even" r:id="rId8"/>
+              <w:headerReference w:type="default" r:id="rId9"/>
+              <w:footerReference w:type="even" r:id="rId10"/>
+              <w:footerReference w:type="default" r:id="rId11"/>
+              <w:headerReference w:type="first" r:id="rId12"/>
+              <w:footerReference w:type="first" r:id="rId13"/>
+              <w:pgSz w:w="12240" w:h="15840"/>
+              <w:pgMar w:top="1440" w:right="1800" w:bottom="1440" w:left="1800" w:header="720" w:footer="720" w:gutter="0"/>
+              <w:cols w:space="720"/>
+              <w:docGrid w:linePitch="360"/>
+            </w:sectPr>
           </w:pPr>
           <w:r>
             <w:rPr>
@@ -548,8 +552,31 @@
       </w:sdtContent>
     </w:sdt>
     <w:p>
+      <w:pPr>
+        <w:rPr>
+          <w:rFonts w:asciiTheme="majorHAnsi" w:eastAsiaTheme="majorEastAsia" w:hAnsiTheme="majorHAnsi" w:cstheme="majorBidi"/>
+          <w:color w:val="17365D" w:themeColor="text2" w:themeShade="BF"/>
+          <w:spacing w:val="5"/>
+          <w:kern w:val="28"/>
+          <w:sz w:val="52"/>
+          <w:szCs w:val="52"/>
+        </w:rPr>
+      </w:pPr>
+    </w:p>
+    <w:p>
+      <w:pPr>
+        <w:rPr>
+          <w:rStyle w:val="DocumentationTok"/>
+          <w:rFonts w:ascii="Sofia Sans" w:hAnsi="Sofia Sans"/>
+          <w:b w:val="0"/>
+          <w:bCs w:val="0"/>
+          <w:i w:val="0"/>
+          <w:color w:val="auto"/>
+          <w:sz w:val="22"/>
+          <w:szCs w:val="24"/>
+        </w:rPr>
+      </w:pPr>
       <w:r>
-        <w:lastRenderedPageBreak/>
         <w:fldChar w:fldCharType="begin"/>
       </w:r>
       <w:r>
@@ -562,33 +589,6 @@
         <w:fldChar w:fldCharType="end"/>
       </w:r>
     </w:p>
-    <w:p>
-      <w:r>
-        <w:br w:type="page"/>
-      </w:r>
-    </w:p>
-    <w:p>
-      <w:pPr>
-        <w:pStyle w:val="Ttulo1"/>
-      </w:pPr>
-      <w:r>
-        <w:lastRenderedPageBreak/>
-        <w:t>Referencias</w:t>
-      </w:r>
-    </w:p>
-    <w:p>
-      <w:pPr>
-        <w:rPr>
-          <w:rStyle w:val="DocumentationTok"/>
-        </w:rPr>
-      </w:pPr>
-      <w:r>
-        <w:rPr>
-          <w:rStyle w:val="DocumentationTok"/>
-        </w:rPr>
-        <w:t>Probando</w:t>
-      </w:r>
-    </w:p>
     <w:sectPr>
       <w:pgSz w:w="12240" w:h="15840"/>
       <w:pgMar w:top="1440" w:right="1800" w:bottom="1440" w:left="1800" w:header="720" w:footer="720" w:gutter="0"/>
@@ -597,6 +597,208 @@
     </w:sectPr>
   </w:body>
 </w:document>
+</file>
+
+<file path=word/endnotes.xml><?xml version="1.0" encoding="utf-8"?>
+<w:endnotes xmlns:wpc="http://schemas.microsoft.com/office/word/2010/wordprocessingCanvas" xmlns:cx="http://schemas.microsoft.com/office/drawing/2014/chartex" xmlns:cx1="http://schemas.microsoft.com/office/drawing/2015/9/8/chartex" xmlns:cx2="http://schemas.microsoft.com/office/drawing/2015/10/21/chartex" xmlns:cx3="http://schemas.microsoft.com/office/drawing/2016/5/9/chartex" xmlns:cx4="http://schemas.microsoft.com/office/drawing/2016/5/10/chartex" xmlns:cx5="http://schemas.microsoft.com/office/drawing/2016/5/11/chartex" xmlns:cx6="http://schemas.microsoft.com/office/drawing/2016/5/12/chartex" xmlns:cx7="http://schemas.microsoft.com/office/drawing/2016/5/13/chartex" xmlns:cx8="http://schemas.microsoft.com/office/drawing/2016/5/14/chartex" xmlns:mc="http://schemas.openxmlformats.org/markup-compatibility/2006" xmlns:m="http://schemas.openxmlformats.org/officeDocument/2006/math" xmlns:aink="http://schemas.microsoft.com/office/drawing/2016/ink" xmlns:am3d="http://schemas.microsoft.com/office/drawing/2017/model3d" xmlns:oel="http://schemas.microsoft.com/office/2019/extlst" xmlns:r="http://schemas.openxmlformats.org/officeDocument/2006/relationships" xmlns:wp14="http://schemas.microsoft.com/office/word/2010/wordprocessingDrawing" xmlns:wp="http://schemas.openxmlformats.org/drawingml/2006/wordprocessingDrawing" xmlns:wpg="http://schemas.microsoft.com/office/word/2010/wordprocessingGroup" xmlns:wpi="http://schemas.microsoft.com/office/word/2010/wordprocessingInk" xmlns:wps="http://schemas.microsoft.com/office/word/2010/wordprocessingShape" xmlns:o="urn:schemas-microsoft-com:office:office" xmlns:v="urn:schemas-microsoft-com:vml" xmlns:w10="urn:schemas-microsoft-com:office:word" xmlns:w="http://schemas.openxmlformats.org/wordprocessingml/2006/main" xmlns:w14="http://schemas.microsoft.com/office/word/2010/wordml" xmlns:w15="http://schemas.microsoft.com/office/word/2012/wordml" xmlns:w16cei="http://schemas.microsoft.com/office/word/2026/wordml/cei" xmlns:w16cex="http://schemas.microsoft.com/office/word/2018/wordml/cex" xmlns:w16cid="http://schemas.microsoft.com/office/word/2016/wordml/cid" xmlns:w16="http://schemas.microsoft.com/office/word/2018/wordml" xmlns:w16sdtdh="http://schemas.microsoft.com/office/word/2020/wordml/sdtdatahash" xmlns:w16sdtfl="http://schemas.microsoft.com/office/word/2024/wordml/sdtformatlock" xmlns:w16se="http://schemas.microsoft.com/office/word/2015/wordml/symex" xmlns:w16du="http://schemas.microsoft.com/office/word/2023/wordml/word16du" xmlns:wne="http://schemas.microsoft.com/office/word/2006/wordml" mc:Ignorable="w14 w15 w16se w16cid w16 w16cex w16sdtdh w16sdtfl w16du wp14">
+  <w:endnote w:type="separator" w:id="-1">
+    <w:p>
+      <w:pPr>
+        <w:spacing w:before="0" w:after="0" w:line="240" w:lineRule="auto"/>
+      </w:pPr>
+      <w:r>
+        <w:separator/>
+      </w:r>
+    </w:p>
+  </w:endnote>
+  <w:endnote w:type="continuationSeparator" w:id="0">
+    <w:p>
+      <w:pPr>
+        <w:spacing w:before="0" w:after="0" w:line="240" w:lineRule="auto"/>
+      </w:pPr>
+      <w:r>
+        <w:continuationSeparator/>
+      </w:r>
+    </w:p>
+  </w:endnote>
+</w:endnotes>
+</file>
+
+<file path=word/footer1.xml><?xml version="1.0" encoding="utf-8"?>
+<w:ftr xmlns:wpc="http://schemas.microsoft.com/office/word/2010/wordprocessingCanvas" xmlns:cx="http://schemas.microsoft.com/office/drawing/2014/chartex" xmlns:cx1="http://schemas.microsoft.com/office/drawing/2015/9/8/chartex" xmlns:cx2="http://schemas.microsoft.com/office/drawing/2015/10/21/chartex" xmlns:cx3="http://schemas.microsoft.com/office/drawing/2016/5/9/chartex" xmlns:cx4="http://schemas.microsoft.com/office/drawing/2016/5/10/chartex" xmlns:cx5="http://schemas.microsoft.com/office/drawing/2016/5/11/chartex" xmlns:cx6="http://schemas.microsoft.com/office/drawing/2016/5/12/chartex" xmlns:cx7="http://schemas.microsoft.com/office/drawing/2016/5/13/chartex" xmlns:cx8="http://schemas.microsoft.com/office/drawing/2016/5/14/chartex" xmlns:mc="http://schemas.openxmlformats.org/markup-compatibility/2006" xmlns:m="http://schemas.openxmlformats.org/officeDocument/2006/math" xmlns:aink="http://schemas.microsoft.com/office/drawing/2016/ink" xmlns:am3d="http://schemas.microsoft.com/office/drawing/2017/model3d" xmlns:oel="http://schemas.microsoft.com/office/2019/extlst" xmlns:r="http://schemas.openxmlformats.org/officeDocument/2006/relationships" xmlns:wp14="http://schemas.microsoft.com/office/word/2010/wordprocessingDrawing" xmlns:wp="http://schemas.openxmlformats.org/drawingml/2006/wordprocessingDrawing" xmlns:wpg="http://schemas.microsoft.com/office/word/2010/wordprocessingGroup" xmlns:wpi="http://schemas.microsoft.com/office/word/2010/wordprocessingInk" xmlns:wps="http://schemas.microsoft.com/office/word/2010/wordprocessingShape" xmlns:o="urn:schemas-microsoft-com:office:office" xmlns:v="urn:schemas-microsoft-com:vml" xmlns:w10="urn:schemas-microsoft-com:office:word" xmlns:w="http://schemas.openxmlformats.org/wordprocessingml/2006/main" xmlns:w14="http://schemas.microsoft.com/office/word/2010/wordml" xmlns:w15="http://schemas.microsoft.com/office/word/2012/wordml" xmlns:w16cei="http://schemas.microsoft.com/office/word/2026/wordml/cei" xmlns:w16cex="http://schemas.microsoft.com/office/word/2018/wordml/cex" xmlns:w16cid="http://schemas.microsoft.com/office/word/2016/wordml/cid" xmlns:w16="http://schemas.microsoft.com/office/word/2018/wordml" xmlns:w16sdtdh="http://schemas.microsoft.com/office/word/2020/wordml/sdtdatahash" xmlns:w16sdtfl="http://schemas.microsoft.com/office/word/2024/wordml/sdtformatlock" xmlns:w16se="http://schemas.microsoft.com/office/word/2015/wordml/symex" xmlns:w16du="http://schemas.microsoft.com/office/word/2023/wordml/word16du" xmlns:wne="http://schemas.microsoft.com/office/word/2006/wordml" mc:Ignorable="w14 w15 w16se w16cid w16 w16cex w16sdtdh w16sdtfl w16du wp14">
+  <w:p>
+    <w:pPr>
+      <w:pStyle w:val="Piedepgina"/>
+    </w:pPr>
+  </w:p>
+</w:ftr>
+</file>
+
+<file path=word/footer2.xml><?xml version="1.0" encoding="utf-8"?>
+<w:ftr xmlns:wpc="http://schemas.microsoft.com/office/word/2010/wordprocessingCanvas" xmlns:cx="http://schemas.microsoft.com/office/drawing/2014/chartex" xmlns:cx1="http://schemas.microsoft.com/office/drawing/2015/9/8/chartex" xmlns:cx2="http://schemas.microsoft.com/office/drawing/2015/10/21/chartex" xmlns:cx3="http://schemas.microsoft.com/office/drawing/2016/5/9/chartex" xmlns:cx4="http://schemas.microsoft.com/office/drawing/2016/5/10/chartex" xmlns:cx5="http://schemas.microsoft.com/office/drawing/2016/5/11/chartex" xmlns:cx6="http://schemas.microsoft.com/office/drawing/2016/5/12/chartex" xmlns:cx7="http://schemas.microsoft.com/office/drawing/2016/5/13/chartex" xmlns:cx8="http://schemas.microsoft.com/office/drawing/2016/5/14/chartex" xmlns:mc="http://schemas.openxmlformats.org/markup-compatibility/2006" xmlns:m="http://schemas.openxmlformats.org/officeDocument/2006/math" xmlns:aink="http://schemas.microsoft.com/office/drawing/2016/ink" xmlns:am3d="http://schemas.microsoft.com/office/drawing/2017/model3d" xmlns:oel="http://schemas.microsoft.com/office/2019/extlst" xmlns:r="http://schemas.openxmlformats.org/officeDocument/2006/relationships" xmlns:wp14="http://schemas.microsoft.com/office/word/2010/wordprocessingDrawing" xmlns:wp="http://schemas.openxmlformats.org/drawingml/2006/wordprocessingDrawing" xmlns:wpg="http://schemas.microsoft.com/office/word/2010/wordprocessingGroup" xmlns:wpi="http://schemas.microsoft.com/office/word/2010/wordprocessingInk" xmlns:wps="http://schemas.microsoft.com/office/word/2010/wordprocessingShape" xmlns:o="urn:schemas-microsoft-com:office:office" xmlns:v="urn:schemas-microsoft-com:vml" xmlns:w10="urn:schemas-microsoft-com:office:word" xmlns:w="http://schemas.openxmlformats.org/wordprocessingml/2006/main" xmlns:w14="http://schemas.microsoft.com/office/word/2010/wordml" xmlns:w15="http://schemas.microsoft.com/office/word/2012/wordml" xmlns:w16cei="http://schemas.microsoft.com/office/word/2026/wordml/cei" xmlns:w16cex="http://schemas.microsoft.com/office/word/2018/wordml/cex" xmlns:w16cid="http://schemas.microsoft.com/office/word/2016/wordml/cid" xmlns:w16="http://schemas.microsoft.com/office/word/2018/wordml" xmlns:w16sdtdh="http://schemas.microsoft.com/office/word/2020/wordml/sdtdatahash" xmlns:w16sdtfl="http://schemas.microsoft.com/office/word/2024/wordml/sdtformatlock" xmlns:w16se="http://schemas.microsoft.com/office/word/2015/wordml/symex" xmlns:w16du="http://schemas.microsoft.com/office/word/2023/wordml/word16du" xmlns:wne="http://schemas.microsoft.com/office/word/2006/wordml" mc:Ignorable="w14 w15 w16se w16cid w16 w16cex w16sdtdh w16sdtfl w16du wp14">
+  <w:p>
+    <w:pPr>
+      <w:pStyle w:val="Piedepgina"/>
+      <w:jc w:val="center"/>
+      <w:rPr>
+        <w:caps/>
+        <w:color w:val="4F81BD" w:themeColor="accent1"/>
+      </w:rPr>
+    </w:pPr>
+    <w:r>
+      <w:rPr>
+        <w:caps/>
+        <w:color w:val="4F81BD" w:themeColor="accent1"/>
+      </w:rPr>
+      <w:fldChar w:fldCharType="begin"/>
+    </w:r>
+    <w:r>
+      <w:rPr>
+        <w:caps/>
+        <w:color w:val="4F81BD" w:themeColor="accent1"/>
+      </w:rPr>
+      <w:instrText>PAGE   \* MERGEFORMAT</w:instrText>
+    </w:r>
+    <w:r>
+      <w:rPr>
+        <w:caps/>
+        <w:color w:val="4F81BD" w:themeColor="accent1"/>
+      </w:rPr>
+      <w:fldChar w:fldCharType="separate"/>
+    </w:r>
+    <w:r>
+      <w:rPr>
+        <w:caps/>
+        <w:color w:val="4F81BD" w:themeColor="accent1"/>
+      </w:rPr>
+      <w:t>2</w:t>
+    </w:r>
+    <w:r>
+      <w:rPr>
+        <w:caps/>
+        <w:color w:val="4F81BD" w:themeColor="accent1"/>
+      </w:rPr>
+      <w:fldChar w:fldCharType="end"/>
+    </w:r>
+  </w:p>
+  <w:p>
+    <w:pPr>
+      <w:pStyle w:val="Piedepgina"/>
+    </w:pPr>
+  </w:p>
+</w:ftr>
+</file>
+
+<file path=word/footer3.xml><?xml version="1.0" encoding="utf-8"?>
+<w:ftr xmlns:wpc="http://schemas.microsoft.com/office/word/2010/wordprocessingCanvas" xmlns:cx="http://schemas.microsoft.com/office/drawing/2014/chartex" xmlns:cx1="http://schemas.microsoft.com/office/drawing/2015/9/8/chartex" xmlns:cx2="http://schemas.microsoft.com/office/drawing/2015/10/21/chartex" xmlns:cx3="http://schemas.microsoft.com/office/drawing/2016/5/9/chartex" xmlns:cx4="http://schemas.microsoft.com/office/drawing/2016/5/10/chartex" xmlns:cx5="http://schemas.microsoft.com/office/drawing/2016/5/11/chartex" xmlns:cx6="http://schemas.microsoft.com/office/drawing/2016/5/12/chartex" xmlns:cx7="http://schemas.microsoft.com/office/drawing/2016/5/13/chartex" xmlns:cx8="http://schemas.microsoft.com/office/drawing/2016/5/14/chartex" xmlns:mc="http://schemas.openxmlformats.org/markup-compatibility/2006" xmlns:m="http://schemas.openxmlformats.org/officeDocument/2006/math" xmlns:aink="http://schemas.microsoft.com/office/drawing/2016/ink" xmlns:am3d="http://schemas.microsoft.com/office/drawing/2017/model3d" xmlns:oel="http://schemas.microsoft.com/office/2019/extlst" xmlns:r="http://schemas.openxmlformats.org/officeDocument/2006/relationships" xmlns:wp14="http://schemas.microsoft.com/office/word/2010/wordprocessingDrawing" xmlns:wp="http://schemas.openxmlformats.org/drawingml/2006/wordprocessingDrawing" xmlns:wpg="http://schemas.microsoft.com/office/word/2010/wordprocessingGroup" xmlns:wpi="http://schemas.microsoft.com/office/word/2010/wordprocessingInk" xmlns:wps="http://schemas.microsoft.com/office/word/2010/wordprocessingShape" xmlns:o="urn:schemas-microsoft-com:office:office" xmlns:v="urn:schemas-microsoft-com:vml" xmlns:w10="urn:schemas-microsoft-com:office:word" xmlns:w="http://schemas.openxmlformats.org/wordprocessingml/2006/main" xmlns:w14="http://schemas.microsoft.com/office/word/2010/wordml" xmlns:w15="http://schemas.microsoft.com/office/word/2012/wordml" xmlns:w16cei="http://schemas.microsoft.com/office/word/2026/wordml/cei" xmlns:w16cex="http://schemas.microsoft.com/office/word/2018/wordml/cex" xmlns:w16cid="http://schemas.microsoft.com/office/word/2016/wordml/cid" xmlns:w16="http://schemas.microsoft.com/office/word/2018/wordml" xmlns:w16sdtdh="http://schemas.microsoft.com/office/word/2020/wordml/sdtdatahash" xmlns:w16sdtfl="http://schemas.microsoft.com/office/word/2024/wordml/sdtformatlock" xmlns:w16se="http://schemas.microsoft.com/office/word/2015/wordml/symex" xmlns:w16du="http://schemas.microsoft.com/office/word/2023/wordml/word16du" xmlns:wne="http://schemas.microsoft.com/office/word/2006/wordml" mc:Ignorable="w14 w15 w16se w16cid w16 w16cex w16sdtdh w16sdtfl w16du wp14">
+  <w:p>
+    <w:pPr>
+      <w:pStyle w:val="Piedepgina"/>
+    </w:pPr>
+  </w:p>
+</w:ftr>
+</file>
+
+<file path=word/footnotes.xml><?xml version="1.0" encoding="utf-8"?>
+<w:footnotes xmlns:wpc="http://schemas.microsoft.com/office/word/2010/wordprocessingCanvas" xmlns:cx="http://schemas.microsoft.com/office/drawing/2014/chartex" xmlns:cx1="http://schemas.microsoft.com/office/drawing/2015/9/8/chartex" xmlns:cx2="http://schemas.microsoft.com/office/drawing/2015/10/21/chartex" xmlns:cx3="http://schemas.microsoft.com/office/drawing/2016/5/9/chartex" xmlns:cx4="http://schemas.microsoft.com/office/drawing/2016/5/10/chartex" xmlns:cx5="http://schemas.microsoft.com/office/drawing/2016/5/11/chartex" xmlns:cx6="http://schemas.microsoft.com/office/drawing/2016/5/12/chartex" xmlns:cx7="http://schemas.microsoft.com/office/drawing/2016/5/13/chartex" xmlns:cx8="http://schemas.microsoft.com/office/drawing/2016/5/14/chartex" xmlns:mc="http://schemas.openxmlformats.org/markup-compatibility/2006" xmlns:m="http://schemas.openxmlformats.org/officeDocument/2006/math" xmlns:aink="http://schemas.microsoft.com/office/drawing/2016/ink" xmlns:am3d="http://schemas.microsoft.com/office/drawing/2017/model3d" xmlns:oel="http://schemas.microsoft.com/office/2019/extlst" xmlns:r="http://schemas.openxmlformats.org/officeDocument/2006/relationships" xmlns:wp14="http://schemas.microsoft.com/office/word/2010/wordprocessingDrawing" xmlns:wp="http://schemas.openxmlformats.org/drawingml/2006/wordprocessingDrawing" xmlns:wpg="http://schemas.microsoft.com/office/word/2010/wordprocessingGroup" xmlns:wpi="http://schemas.microsoft.com/office/word/2010/wordprocessingInk" xmlns:wps="http://schemas.microsoft.com/office/word/2010/wordprocessingShape" xmlns:o="urn:schemas-microsoft-com:office:office" xmlns:v="urn:schemas-microsoft-com:vml" xmlns:w10="urn:schemas-microsoft-com:office:word" xmlns:w="http://schemas.openxmlformats.org/wordprocessingml/2006/main" xmlns:w14="http://schemas.microsoft.com/office/word/2010/wordml" xmlns:w15="http://schemas.microsoft.com/office/word/2012/wordml" xmlns:w16cei="http://schemas.microsoft.com/office/word/2026/wordml/cei" xmlns:w16cex="http://schemas.microsoft.com/office/word/2018/wordml/cex" xmlns:w16cid="http://schemas.microsoft.com/office/word/2016/wordml/cid" xmlns:w16="http://schemas.microsoft.com/office/word/2018/wordml" xmlns:w16sdtdh="http://schemas.microsoft.com/office/word/2020/wordml/sdtdatahash" xmlns:w16sdtfl="http://schemas.microsoft.com/office/word/2024/wordml/sdtformatlock" xmlns:w16se="http://schemas.microsoft.com/office/word/2015/wordml/symex" xmlns:w16du="http://schemas.microsoft.com/office/word/2023/wordml/word16du" xmlns:wne="http://schemas.microsoft.com/office/word/2006/wordml" mc:Ignorable="w14 w15 w16se w16cid w16 w16cex w16sdtdh w16sdtfl w16du wp14">
+  <w:footnote w:type="separator" w:id="-1">
+    <w:p>
+      <w:pPr>
+        <w:spacing w:before="0" w:after="0" w:line="240" w:lineRule="auto"/>
+      </w:pPr>
+      <w:r>
+        <w:separator/>
+      </w:r>
+    </w:p>
+  </w:footnote>
+  <w:footnote w:type="continuationSeparator" w:id="0">
+    <w:p>
+      <w:pPr>
+        <w:spacing w:before="0" w:after="0" w:line="240" w:lineRule="auto"/>
+      </w:pPr>
+      <w:r>
+        <w:continuationSeparator/>
+      </w:r>
+    </w:p>
+  </w:footnote>
+</w:footnotes>
+</file>
+
+<file path=word/header1.xml><?xml version="1.0" encoding="utf-8"?>
+<w:hdr xmlns:wpc="http://schemas.microsoft.com/office/word/2010/wordprocessingCanvas" xmlns:cx="http://schemas.microsoft.com/office/drawing/2014/chartex" xmlns:cx1="http://schemas.microsoft.com/office/drawing/2015/9/8/chartex" xmlns:cx2="http://schemas.microsoft.com/office/drawing/2015/10/21/chartex" xmlns:cx3="http://schemas.microsoft.com/office/drawing/2016/5/9/chartex" xmlns:cx4="http://schemas.microsoft.com/office/drawing/2016/5/10/chartex" xmlns:cx5="http://schemas.microsoft.com/office/drawing/2016/5/11/chartex" xmlns:cx6="http://schemas.microsoft.com/office/drawing/2016/5/12/chartex" xmlns:cx7="http://schemas.microsoft.com/office/drawing/2016/5/13/chartex" xmlns:cx8="http://schemas.microsoft.com/office/drawing/2016/5/14/chartex" xmlns:mc="http://schemas.openxmlformats.org/markup-compatibility/2006" xmlns:m="http://schemas.openxmlformats.org/officeDocument/2006/math" xmlns:aink="http://schemas.microsoft.com/office/drawing/2016/ink" xmlns:am3d="http://schemas.microsoft.com/office/drawing/2017/model3d" xmlns:oel="http://schemas.microsoft.com/office/2019/extlst" xmlns:r="http://schemas.openxmlformats.org/officeDocument/2006/relationships" xmlns:wp14="http://schemas.microsoft.com/office/word/2010/wordprocessingDrawing" xmlns:wp="http://schemas.openxmlformats.org/drawingml/2006/wordprocessingDrawing" xmlns:wpg="http://schemas.microsoft.com/office/word/2010/wordprocessingGroup" xmlns:wpi="http://schemas.microsoft.com/office/word/2010/wordprocessingInk" xmlns:wps="http://schemas.microsoft.com/office/word/2010/wordprocessingShape" xmlns:o="urn:schemas-microsoft-com:office:office" xmlns:v="urn:schemas-microsoft-com:vml" xmlns:w10="urn:schemas-microsoft-com:office:word" xmlns:w="http://schemas.openxmlformats.org/wordprocessingml/2006/main" xmlns:w14="http://schemas.microsoft.com/office/word/2010/wordml" xmlns:w15="http://schemas.microsoft.com/office/word/2012/wordml" xmlns:w16cei="http://schemas.microsoft.com/office/word/2026/wordml/cei" xmlns:w16cex="http://schemas.microsoft.com/office/word/2018/wordml/cex" xmlns:w16cid="http://schemas.microsoft.com/office/word/2016/wordml/cid" xmlns:w16="http://schemas.microsoft.com/office/word/2018/wordml" xmlns:w16sdtdh="http://schemas.microsoft.com/office/word/2020/wordml/sdtdatahash" xmlns:w16sdtfl="http://schemas.microsoft.com/office/word/2024/wordml/sdtformatlock" xmlns:w16se="http://schemas.microsoft.com/office/word/2015/wordml/symex" xmlns:w16du="http://schemas.microsoft.com/office/word/2023/wordml/word16du" xmlns:wne="http://schemas.microsoft.com/office/word/2006/wordml" mc:Ignorable="w14 w15 w16se w16cid w16 w16cex w16sdtdh w16sdtfl w16du wp14">
+  <w:p>
+    <w:pPr>
+      <w:pStyle w:val="Encabezado"/>
+    </w:pPr>
+  </w:p>
+</w:hdr>
+</file>
+
+<file path=word/header2.xml><?xml version="1.0" encoding="utf-8"?>
+<w:hdr xmlns:wpc="http://schemas.microsoft.com/office/word/2010/wordprocessingCanvas" xmlns:cx="http://schemas.microsoft.com/office/drawing/2014/chartex" xmlns:cx1="http://schemas.microsoft.com/office/drawing/2015/9/8/chartex" xmlns:cx2="http://schemas.microsoft.com/office/drawing/2015/10/21/chartex" xmlns:cx3="http://schemas.microsoft.com/office/drawing/2016/5/9/chartex" xmlns:cx4="http://schemas.microsoft.com/office/drawing/2016/5/10/chartex" xmlns:cx5="http://schemas.microsoft.com/office/drawing/2016/5/11/chartex" xmlns:cx6="http://schemas.microsoft.com/office/drawing/2016/5/12/chartex" xmlns:cx7="http://schemas.microsoft.com/office/drawing/2016/5/13/chartex" xmlns:cx8="http://schemas.microsoft.com/office/drawing/2016/5/14/chartex" xmlns:mc="http://schemas.openxmlformats.org/markup-compatibility/2006" xmlns:m="http://schemas.openxmlformats.org/officeDocument/2006/math" xmlns:aink="http://schemas.microsoft.com/office/drawing/2016/ink" xmlns:am3d="http://schemas.microsoft.com/office/drawing/2017/model3d" xmlns:oel="http://schemas.microsoft.com/office/2019/extlst" xmlns:r="http://schemas.openxmlformats.org/officeDocument/2006/relationships" xmlns:wp14="http://schemas.microsoft.com/office/word/2010/wordprocessingDrawing" xmlns:wp="http://schemas.openxmlformats.org/drawingml/2006/wordprocessingDrawing" xmlns:wpg="http://schemas.microsoft.com/office/word/2010/wordprocessingGroup" xmlns:wpi="http://schemas.microsoft.com/office/word/2010/wordprocessingInk" xmlns:wps="http://schemas.microsoft.com/office/word/2010/wordprocessingShape" xmlns:o="urn:schemas-microsoft-com:office:office" xmlns:v="urn:schemas-microsoft-com:vml" xmlns:w10="urn:schemas-microsoft-com:office:word" xmlns:w="http://schemas.openxmlformats.org/wordprocessingml/2006/main" xmlns:w14="http://schemas.microsoft.com/office/word/2010/wordml" xmlns:w15="http://schemas.microsoft.com/office/word/2012/wordml" xmlns:w16cei="http://schemas.microsoft.com/office/word/2026/wordml/cei" xmlns:w16cex="http://schemas.microsoft.com/office/word/2018/wordml/cex" xmlns:w16cid="http://schemas.microsoft.com/office/word/2016/wordml/cid" xmlns:w16="http://schemas.microsoft.com/office/word/2018/wordml" xmlns:w16sdtdh="http://schemas.microsoft.com/office/word/2020/wordml/sdtdatahash" xmlns:w16sdtfl="http://schemas.microsoft.com/office/word/2024/wordml/sdtformatlock" xmlns:w16se="http://schemas.microsoft.com/office/word/2015/wordml/symex" xmlns:w16du="http://schemas.microsoft.com/office/word/2023/wordml/word16du" xmlns:wne="http://schemas.microsoft.com/office/word/2006/wordml" mc:Ignorable="w14 w15 w16se w16cid w16 w16cex w16sdtdh w16sdtfl w16du wp14">
+  <w:p>
+    <w:pPr>
+      <w:pStyle w:val="Encabezado"/>
+      <w:jc w:val="center"/>
+    </w:pPr>
+    <w:r>
+      <w:rPr>
+        <w:noProof/>
+      </w:rPr>
+      <w:drawing>
+        <wp:inline distT="0" distB="0" distL="0" distR="0" wp14:anchorId="40C7AB24" wp14:editId="13A06DB1">
+          <wp:extent cx="1222873" cy="522410"/>
+          <wp:effectExtent l="0" t="0" r="0" b="0"/>
+          <wp:docPr id="397774122" name="Gráfico 3"/>
+          <wp:cNvGraphicFramePr>
+            <a:graphicFrameLocks xmlns:a="http://schemas.openxmlformats.org/drawingml/2006/main" noChangeAspect="1"/>
+          </wp:cNvGraphicFramePr>
+          <a:graphic xmlns:a="http://schemas.openxmlformats.org/drawingml/2006/main">
+            <a:graphicData uri="http://schemas.openxmlformats.org/drawingml/2006/picture">
+              <pic:pic xmlns:pic="http://schemas.openxmlformats.org/drawingml/2006/picture">
+                <pic:nvPicPr>
+                  <pic:cNvPr id="397774122" name="Gráfico 397774122"/>
+                  <pic:cNvPicPr/>
+                </pic:nvPicPr>
+                <pic:blipFill>
+                  <a:blip r:embed="rId1">
+                    <a:extLst>
+                      <a:ext uri="{96DAC541-7B7A-43D3-8B79-37D633B846F1}">
+                        <asvg:svgBlip xmlns:asvg="http://schemas.microsoft.com/office/drawing/2016/SVG/main" r:embed="rId2"/>
+                      </a:ext>
+                    </a:extLst>
+                  </a:blip>
+                  <a:stretch>
+                    <a:fillRect/>
+                  </a:stretch>
+                </pic:blipFill>
+                <pic:spPr>
+                  <a:xfrm>
+                    <a:off x="0" y="0"/>
+                    <a:ext cx="1370816" cy="585611"/>
+                  </a:xfrm>
+                  <a:prstGeom prst="rect">
+                    <a:avLst/>
+                  </a:prstGeom>
+                </pic:spPr>
+              </pic:pic>
+            </a:graphicData>
+          </a:graphic>
+        </wp:inline>
+      </w:drawing>
+    </w:r>
+  </w:p>
+</w:hdr>
+</file>
+
+<file path=word/header3.xml><?xml version="1.0" encoding="utf-8"?>
+<w:hdr xmlns:wpc="http://schemas.microsoft.com/office/word/2010/wordprocessingCanvas" xmlns:cx="http://schemas.microsoft.com/office/drawing/2014/chartex" xmlns:cx1="http://schemas.microsoft.com/office/drawing/2015/9/8/chartex" xmlns:cx2="http://schemas.microsoft.com/office/drawing/2015/10/21/chartex" xmlns:cx3="http://schemas.microsoft.com/office/drawing/2016/5/9/chartex" xmlns:cx4="http://schemas.microsoft.com/office/drawing/2016/5/10/chartex" xmlns:cx5="http://schemas.microsoft.com/office/drawing/2016/5/11/chartex" xmlns:cx6="http://schemas.microsoft.com/office/drawing/2016/5/12/chartex" xmlns:cx7="http://schemas.microsoft.com/office/drawing/2016/5/13/chartex" xmlns:cx8="http://schemas.microsoft.com/office/drawing/2016/5/14/chartex" xmlns:mc="http://schemas.openxmlformats.org/markup-compatibility/2006" xmlns:m="http://schemas.openxmlformats.org/officeDocument/2006/math" xmlns:aink="http://schemas.microsoft.com/office/drawing/2016/ink" xmlns:am3d="http://schemas.microsoft.com/office/drawing/2017/model3d" xmlns:oel="http://schemas.microsoft.com/office/2019/extlst" xmlns:r="http://schemas.openxmlformats.org/officeDocument/2006/relationships" xmlns:wp14="http://schemas.microsoft.com/office/word/2010/wordprocessingDrawing" xmlns:wp="http://schemas.openxmlformats.org/drawingml/2006/wordprocessingDrawing" xmlns:wpg="http://schemas.microsoft.com/office/word/2010/wordprocessingGroup" xmlns:wpi="http://schemas.microsoft.com/office/word/2010/wordprocessingInk" xmlns:wps="http://schemas.microsoft.com/office/word/2010/wordprocessingShape" xmlns:o="urn:schemas-microsoft-com:office:office" xmlns:v="urn:schemas-microsoft-com:vml" xmlns:w10="urn:schemas-microsoft-com:office:word" xmlns:w="http://schemas.openxmlformats.org/wordprocessingml/2006/main" xmlns:w14="http://schemas.microsoft.com/office/word/2010/wordml" xmlns:w15="http://schemas.microsoft.com/office/word/2012/wordml" xmlns:w16cei="http://schemas.microsoft.com/office/word/2026/wordml/cei" xmlns:w16cex="http://schemas.microsoft.com/office/word/2018/wordml/cex" xmlns:w16cid="http://schemas.microsoft.com/office/word/2016/wordml/cid" xmlns:w16="http://schemas.microsoft.com/office/word/2018/wordml" xmlns:w16sdtdh="http://schemas.microsoft.com/office/word/2020/wordml/sdtdatahash" xmlns:w16sdtfl="http://schemas.microsoft.com/office/word/2024/wordml/sdtformatlock" xmlns:w16se="http://schemas.microsoft.com/office/word/2015/wordml/symex" xmlns:w16du="http://schemas.microsoft.com/office/word/2023/wordml/word16du" xmlns:wne="http://schemas.microsoft.com/office/word/2006/wordml" mc:Ignorable="w14 w15 w16se w16cid w16 w16cex w16sdtdh w16sdtfl w16du wp14">
+  <w:p>
+    <w:pPr>
+      <w:pStyle w:val="Encabezado"/>
+    </w:pPr>
+  </w:p>
+</w:hdr>
 </file>
 
 <file path=word/numbering.xml><?xml version="1.0" encoding="utf-8"?>
@@ -1941,7 +2143,6 @@
     <w:uiPriority w:val="1"/>
     <w:semiHidden/>
     <w:unhideWhenUsed/>
-    <w:rsid w:val="002819E2"/>
   </w:style>
   <w:style w:type="table" w:default="1" w:styleId="Tablanormal">
     <w:name w:val="Normal Table"/>
@@ -1963,7 +2164,6 @@
     <w:uiPriority w:val="99"/>
     <w:semiHidden/>
     <w:unhideWhenUsed/>
-    <w:rsid w:val="002819E2"/>
   </w:style>
   <w:style w:type="paragraph" w:styleId="Encabezado">
     <w:name w:val="header"/>

</xml_diff>